<commit_message>
Validate nuisance initial-state theory, heterogeneous records and EJS manuscript
</commit_message>
<xml_diff>
--- a/manuscript/weak_efficiency_theory.docx
+++ b/manuscript/weak_efficiency_theory.docx
@@ -206,10 +206,14 @@
       </w:r>
       <m:oMath>
         <m:r>
-          <m:t>A</m:t>
-        </m:r>
-        <m:r>
-          <m:t>h</m:t>
+          <m:rPr>
+            <m:scr m:val="script"/>
+            <m:sty m:val="p"/>
+          </m:rPr>
+          <m:t>D</m:t>
+        </m:r>
+        <m:r>
+          <m:t>v</m:t>
         </m:r>
         <m:r>
           <m:rPr>
@@ -220,7 +224,7 @@
         <m:sSup>
           <m:e>
             <m:r>
-              <m:t>h</m:t>
+              <m:t>v</m:t>
             </m:r>
           </m:e>
           <m:sup>
@@ -242,7 +246,7 @@
           <m:t>J</m:t>
         </m:r>
         <m:r>
-          <m:t>h</m:t>
+          <m:t>v</m:t>
         </m:r>
       </m:oMath>
       <w:r>
@@ -258,7 +262,11 @@
         <m:sSup>
           <m:e>
             <m:r>
-              <m:t>A</m:t>
+              <m:rPr>
+                <m:scr m:val="script"/>
+                <m:sty m:val="p"/>
+              </m:rPr>
+              <m:t>D</m:t>
             </m:r>
           </m:e>
           <m:sup>
@@ -589,7 +597,77 @@
         <w:pStyle w:val="FirstParagraph"/>
       </w:pPr>
       <w:r>
-        <w:t xml:space="preserve">This definition includes ordinary integrated influences and endpoint evaluation measures. It is the variance norm of the associated Gaussian linear observation; the noise path itself need not belong to</w:t>
+        <w:t xml:space="preserve">This definition includes ordinary integrated influences and endpoint evaluation measures. General dual influences act through the</w:t>
+      </w:r>
+      <w:r>
+        <w:t xml:space="preserve"> </w:t>
+      </w:r>
+      <m:oMath>
+        <m:sSup>
+          <m:e>
+            <m:r>
+              <m:t>L</m:t>
+            </m:r>
+          </m:e>
+          <m:sup>
+            <m:r>
+              <m:t>2</m:t>
+            </m:r>
+          </m:sup>
+        </m:sSup>
+        <m:r>
+          <m:rPr>
+            <m:sty m:val="p"/>
+          </m:rPr>
+          <m:t>(</m:t>
+        </m:r>
+        <m:r>
+          <m:t>P</m:t>
+        </m:r>
+        <m:r>
+          <m:rPr>
+            <m:sty m:val="p"/>
+          </m:rPr>
+          <m:t>)</m:t>
+        </m:r>
+      </m:oMath>
+      <w:r>
+        <w:t xml:space="preserve"> </w:t>
+      </w:r>
+      <w:r>
+        <w:t xml:space="preserve">closure of integrated Gaussian observations, rather than a pathwise pairing for every distribution. Their variance norm is</w:t>
+      </w:r>
+      <w:r>
+        <w:t xml:space="preserve"> </w:t>
+      </w:r>
+      <m:oMath>
+        <m:r>
+          <m:rPr>
+            <m:sty m:val="p"/>
+          </m:rPr>
+          <m:t>∥</m:t>
+        </m:r>
+        <m:r>
+          <m:t>λ</m:t>
+        </m:r>
+        <m:sSub>
+          <m:e>
+            <m:r>
+              <m:rPr>
+                <m:sty m:val="p"/>
+              </m:rPr>
+              <m:t>∥</m:t>
+            </m:r>
+          </m:e>
+          <m:sub>
+            <m:r>
+              <m:t>C</m:t>
+            </m:r>
+          </m:sub>
+        </m:sSub>
+      </m:oMath>
+      <w:r>
+        <w:t xml:space="preserve">; the noise path itself need not belong to</w:t>
       </w:r>
       <w:r>
         <w:t xml:space="preserve"> </w:t>
@@ -657,7 +735,11 @@
           <m:sSup>
             <m:e>
               <m:r>
-                <m:t>A</m:t>
+                <m:rPr>
+                  <m:scr m:val="script"/>
+                  <m:sty m:val="p"/>
+                </m:rPr>
+                <m:t>D</m:t>
               </m:r>
             </m:e>
             <m:sup>
@@ -896,7 +978,11 @@
                   <m:sSup>
                     <m:e>
                       <m:r>
-                        <m:t>A</m:t>
+                        <m:rPr>
+                          <m:scr m:val="script"/>
+                          <m:sty m:val="p"/>
+                        </m:rPr>
+                        <m:t>D</m:t>
                       </m:r>
                     </m:e>
                     <m:sup>
@@ -1164,7 +1250,11 @@
         <m:sSup>
           <m:e>
             <m:r>
-              <m:t>A</m:t>
+              <m:rPr>
+                <m:scr m:val="script"/>
+                <m:sty m:val="p"/>
+              </m:rPr>
+              <m:t>D</m:t>
             </m:r>
           </m:e>
           <m:sup>
@@ -1446,7 +1536,11 @@
         <m:sSup>
           <m:e>
             <m:r>
-              <m:t>A</m:t>
+              <m:rPr>
+                <m:scr m:val="script"/>
+                <m:sty m:val="p"/>
+              </m:rPr>
+              <m:t>D</m:t>
             </m:r>
           </m:e>
           <m:sup>
@@ -1540,7 +1634,11 @@
         <m:sSup>
           <m:e>
             <m:r>
-              <m:t>A</m:t>
+              <m:rPr>
+                <m:scr m:val="script"/>
+                <m:sty m:val="p"/>
+              </m:rPr>
+              <m:t>D</m:t>
             </m:r>
           </m:e>
           <m:sup>
@@ -1628,7 +1726,7 @@
       </w:r>
       <m:oMath>
         <m:r>
-          <m:t>h</m:t>
+          <m:t>v</m:t>
         </m:r>
         <m:r>
           <m:rPr>
@@ -1657,7 +1755,11 @@
         <m:sSup>
           <m:e>
             <m:r>
-              <m:t>A</m:t>
+              <m:rPr>
+                <m:scr m:val="script"/>
+                <m:sty m:val="p"/>
+              </m:rPr>
+              <m:t>D</m:t>
             </m:r>
           </m:e>
           <m:sup>
@@ -1684,10 +1786,14 @@
       </w:r>
       <m:oMath>
         <m:r>
-          <m:t>A</m:t>
-        </m:r>
-        <m:r>
-          <m:t>h</m:t>
+          <m:rPr>
+            <m:scr m:val="script"/>
+            <m:sty m:val="p"/>
+          </m:rPr>
+          <m:t>D</m:t>
+        </m:r>
+        <m:r>
+          <m:t>v</m:t>
         </m:r>
         <m:r>
           <m:rPr>
@@ -1710,7 +1816,7 @@
       </w:r>
       <m:oMath>
         <m:r>
-          <m:t>h</m:t>
+          <m:t>v</m:t>
         </m:r>
         <m:r>
           <m:rPr>
@@ -1812,12 +1918,229 @@
         <w:pStyle w:val="BodyText"/>
       </w:pPr>
       <w:r>
-        <w:t xml:space="preserve">Zero values at the endpoints do not imply compact support. Equality for literal compact tests, without a closure or an</w:t>
-      </w:r>
-      <w:r>
-        <w:t xml:space="preserve"> </w:t>
-      </w:r>
-      <m:oMath>
+        <w:t xml:space="preserve">The exact range uses zero-endpoint Sobolev tests; literal compact tests require closure. The covariance norm is equivalent to the dual Sobolev norm for this positive OU model.</w:t>
+      </w:r>
+    </w:p>
+    <w:p>
+      <w:pPr>
+        <w:pStyle w:val="BodyText"/>
+      </w:pPr>
+      <w:r>
+        <w:rPr>
+          <w:b/>
+          <w:bCs/>
+        </w:rPr>
+        <w:t xml:space="preserve">Lemma 1 (a concrete dense test family).</w:t>
+      </w:r>
+      <w:r>
+        <w:t xml:space="preserve"> </w:t>
+      </w:r>
+      <w:r>
+        <w:t xml:space="preserve">Let</w:t>
+      </w:r>
+      <w:r>
+        <w:t xml:space="preserve"> </w:t>
+      </w:r>
+      <m:oMath>
+        <m:sSub>
+          <m:e>
+            <m:r>
+              <m:t>V</m:t>
+            </m:r>
+          </m:e>
+          <m:sub>
+            <m:r>
+              <m:t>m</m:t>
+            </m:r>
+          </m:sub>
+        </m:sSub>
+      </m:oMath>
+      <w:r>
+        <w:t xml:space="preserve"> </w:t>
+      </w:r>
+      <w:r>
+        <w:t xml:space="preserve">be vector-valued continuous piecewise-linear splines on the nested uniform dyadic partitions of</w:t>
+      </w:r>
+      <w:r>
+        <w:t xml:space="preserve"> </w:t>
+      </w:r>
+      <m:oMath>
+        <m:r>
+          <m:rPr>
+            <m:sty m:val="p"/>
+          </m:rPr>
+          <m:t>[</m:t>
+        </m:r>
+        <m:r>
+          <m:t>0</m:t>
+        </m:r>
+        <m:r>
+          <m:rPr>
+            <m:sty m:val="p"/>
+          </m:rPr>
+          <m:t>,</m:t>
+        </m:r>
+        <m:r>
+          <m:t>T</m:t>
+        </m:r>
+        <m:r>
+          <m:rPr>
+            <m:sty m:val="p"/>
+          </m:rPr>
+          <m:t>]</m:t>
+        </m:r>
+      </m:oMath>
+      <w:r>
+        <w:t xml:space="preserve">, with zero values at both endpoints. Then</w:t>
+      </w:r>
+    </w:p>
+    <w:p>
+      <w:pPr>
+        <w:pStyle w:val="BodyText"/>
+      </w:pPr>
+      <m:oMathPara>
+        <m:oMathParaPr>
+          <m:jc m:val="center"/>
+        </m:oMathParaPr>
+        <m:oMath>
+          <m:sSup>
+            <m:e>
+              <m:bar>
+                <m:barPr>
+                  <m:pos m:val="top"/>
+                </m:barPr>
+                <m:e>
+                  <m:limLow>
+                    <m:e>
+                      <m:r>
+                        <m:rPr>
+                          <m:sty m:val="p"/>
+                        </m:rPr>
+                        <m:t>⋃</m:t>
+                      </m:r>
+                    </m:e>
+                    <m:lim>
+                      <m:r>
+                        <m:t>m</m:t>
+                      </m:r>
+                    </m:lim>
+                  </m:limLow>
+                  <m:sSup>
+                    <m:e>
+                      <m:r>
+                        <m:rPr>
+                          <m:scr m:val="script"/>
+                          <m:sty m:val="p"/>
+                        </m:rPr>
+                        <m:t>D</m:t>
+                      </m:r>
+                    </m:e>
+                    <m:sup>
+                      <m:r>
+                        <m:rPr>
+                          <m:sty m:val="p"/>
+                        </m:rPr>
+                        <m:t>*</m:t>
+                      </m:r>
+                    </m:sup>
+                  </m:sSup>
+                  <m:sSub>
+                    <m:e>
+                      <m:r>
+                        <m:t>V</m:t>
+                      </m:r>
+                    </m:e>
+                    <m:sub>
+                      <m:r>
+                        <m:t>m</m:t>
+                      </m:r>
+                    </m:sub>
+                  </m:sSub>
+                </m:e>
+              </m:bar>
+            </m:e>
+            <m:sup>
+              <m:r>
+                <m:rPr>
+                  <m:sty m:val="p"/>
+                </m:rPr>
+                <m:t>∥</m:t>
+              </m:r>
+              <m:r>
+                <m:rPr>
+                  <m:sty m:val="p"/>
+                </m:rPr>
+                <m:t>⋅</m:t>
+              </m:r>
+              <m:sSub>
+                <m:e>
+                  <m:r>
+                    <m:rPr>
+                      <m:sty m:val="p"/>
+                    </m:rPr>
+                    <m:t>∥</m:t>
+                  </m:r>
+                </m:e>
+                <m:sub>
+                  <m:r>
+                    <m:t>C</m:t>
+                  </m:r>
+                </m:sub>
+              </m:sSub>
+            </m:sup>
+          </m:sSup>
+          <m:r>
+            <m:rPr>
+              <m:sty m:val="p"/>
+            </m:rPr>
+            <m:t>=</m:t>
+          </m:r>
+          <m:r>
+            <m:rPr>
+              <m:scr m:val="script"/>
+              <m:sty m:val="p"/>
+            </m:rPr>
+            <m:t>M</m:t>
+          </m:r>
+          <m:r>
+            <m:rPr>
+              <m:sty m:val="p"/>
+            </m:rPr>
+            <m:t>.</m:t>
+          </m:r>
+        </m:oMath>
+      </m:oMathPara>
+    </w:p>
+    <w:p>
+      <w:pPr>
+        <w:pStyle w:val="FirstParagraph"/>
+      </w:pPr>
+      <w:r>
+        <w:rPr>
+          <w:b/>
+          <w:bCs/>
+        </w:rPr>
+        <w:t xml:space="preserve">Proof.</w:t>
+      </w:r>
+      <w:r>
+        <w:t xml:space="preserve"> </w:t>
+      </w:r>
+      <w:r>
+        <w:t xml:space="preserve">Given</w:t>
+      </w:r>
+      <w:r>
+        <w:t xml:space="preserve"> </w:t>
+      </w:r>
+      <m:oMath>
+        <m:r>
+          <m:t>v</m:t>
+        </m:r>
+        <m:r>
+          <m:rPr>
+            <m:sty m:val="p"/>
+          </m:rPr>
+          <m:t>∈</m:t>
+        </m:r>
         <m:sSubSup>
           <m:e>
             <m:r>
@@ -1837,10 +2160,558 @@
         </m:sSubSup>
       </m:oMath>
       <w:r>
-        <w:t xml:space="preserve"> </w:t>
-      </w:r>
-      <w:r>
-        <w:t xml:space="preserve">qualification, would be false. The relevant closure uses the covariance norm, which is equivalent to the dual Sobolev norm for this positive OU model.</w:t>
+        <w:t xml:space="preserve">, choose</w:t>
+      </w:r>
+      <w:r>
+        <w:t xml:space="preserve"> </w:t>
+      </w:r>
+      <m:oMath>
+        <m:r>
+          <m:t>ψ</m:t>
+        </m:r>
+        <m:r>
+          <m:rPr>
+            <m:sty m:val="p"/>
+          </m:rPr>
+          <m:t>∈</m:t>
+        </m:r>
+        <m:sSubSup>
+          <m:e>
+            <m:r>
+              <m:t>C</m:t>
+            </m:r>
+          </m:e>
+          <m:sub>
+            <m:r>
+              <m:t>c</m:t>
+            </m:r>
+          </m:sub>
+          <m:sup>
+            <m:r>
+              <m:rPr>
+                <m:sty m:val="p"/>
+              </m:rPr>
+              <m:t>∞</m:t>
+            </m:r>
+          </m:sup>
+        </m:sSubSup>
+      </m:oMath>
+      <w:r>
+        <w:t xml:space="preserve"> </w:t>
+      </w:r>
+      <w:r>
+        <w:t xml:space="preserve">close to</w:t>
+      </w:r>
+      <w:r>
+        <w:t xml:space="preserve"> </w:t>
+      </w:r>
+      <m:oMath>
+        <m:r>
+          <m:t>v</m:t>
+        </m:r>
+      </m:oMath>
+      <w:r>
+        <w:t xml:space="preserve"> </w:t>
+      </w:r>
+      <w:r>
+        <w:t xml:space="preserve">in</w:t>
+      </w:r>
+      <w:r>
+        <w:t xml:space="preserve"> </w:t>
+      </w:r>
+      <m:oMath>
+        <m:sSup>
+          <m:e>
+            <m:r>
+              <m:t>H</m:t>
+            </m:r>
+          </m:e>
+          <m:sup>
+            <m:r>
+              <m:t>1</m:t>
+            </m:r>
+          </m:sup>
+        </m:sSup>
+      </m:oMath>
+      <w:r>
+        <w:t xml:space="preserve">. Its nodal interpolant</w:t>
+      </w:r>
+      <w:r>
+        <w:t xml:space="preserve"> </w:t>
+      </w:r>
+      <m:oMath>
+        <m:sSub>
+          <m:e>
+            <m:r>
+              <m:t>I</m:t>
+            </m:r>
+          </m:e>
+          <m:sub>
+            <m:r>
+              <m:t>m</m:t>
+            </m:r>
+          </m:sub>
+        </m:sSub>
+        <m:r>
+          <m:t>ψ</m:t>
+        </m:r>
+        <m:r>
+          <m:rPr>
+            <m:sty m:val="p"/>
+          </m:rPr>
+          <m:t>∈</m:t>
+        </m:r>
+        <m:sSub>
+          <m:e>
+            <m:r>
+              <m:t>V</m:t>
+            </m:r>
+          </m:e>
+          <m:sub>
+            <m:r>
+              <m:t>m</m:t>
+            </m:r>
+          </m:sub>
+        </m:sSub>
+      </m:oMath>
+      <w:r>
+        <w:t xml:space="preserve"> </w:t>
+      </w:r>
+      <w:r>
+        <w:t xml:space="preserve">satisfies</w:t>
+      </w:r>
+      <w:r>
+        <w:t xml:space="preserve"> </w:t>
+      </w:r>
+      <m:oMath>
+        <m:r>
+          <m:rPr>
+            <m:sty m:val="p"/>
+          </m:rPr>
+          <m:t>∥</m:t>
+        </m:r>
+        <m:sSub>
+          <m:e>
+            <m:r>
+              <m:t>I</m:t>
+            </m:r>
+          </m:e>
+          <m:sub>
+            <m:r>
+              <m:t>m</m:t>
+            </m:r>
+          </m:sub>
+        </m:sSub>
+        <m:r>
+          <m:t>ψ</m:t>
+        </m:r>
+        <m:r>
+          <m:rPr>
+            <m:sty m:val="p"/>
+          </m:rPr>
+          <m:t>−</m:t>
+        </m:r>
+        <m:r>
+          <m:t>ψ</m:t>
+        </m:r>
+        <m:sSub>
+          <m:e>
+            <m:r>
+              <m:rPr>
+                <m:sty m:val="p"/>
+              </m:rPr>
+              <m:t>∥</m:t>
+            </m:r>
+          </m:e>
+          <m:sub>
+            <m:sSup>
+              <m:e>
+                <m:r>
+                  <m:t>H</m:t>
+                </m:r>
+              </m:e>
+              <m:sup>
+                <m:r>
+                  <m:t>1</m:t>
+                </m:r>
+              </m:sup>
+            </m:sSup>
+          </m:sub>
+        </m:sSub>
+        <m:r>
+          <m:rPr>
+            <m:sty m:val="p"/>
+          </m:rPr>
+          <m:t>≤</m:t>
+        </m:r>
+        <m:r>
+          <m:t>c</m:t>
+        </m:r>
+        <m:sSub>
+          <m:e>
+            <m:r>
+              <m:rPr>
+                <m:sty m:val="p"/>
+              </m:rPr>
+              <m:t>Δ</m:t>
+            </m:r>
+          </m:e>
+          <m:sub>
+            <m:r>
+              <m:t>m</m:t>
+            </m:r>
+          </m:sub>
+        </m:sSub>
+        <m:r>
+          <m:rPr>
+            <m:sty m:val="p"/>
+          </m:rPr>
+          <m:t>∥</m:t>
+        </m:r>
+        <m:sSup>
+          <m:e>
+            <m:r>
+              <m:t>ψ</m:t>
+            </m:r>
+          </m:e>
+          <m:sup>
+            <m:r>
+              <m:rPr>
+                <m:sty m:val="p"/>
+              </m:rPr>
+              <m:t>″</m:t>
+            </m:r>
+          </m:sup>
+        </m:sSup>
+        <m:sSub>
+          <m:e>
+            <m:r>
+              <m:rPr>
+                <m:sty m:val="p"/>
+              </m:rPr>
+              <m:t>∥</m:t>
+            </m:r>
+          </m:e>
+          <m:sub>
+            <m:sSup>
+              <m:e>
+                <m:r>
+                  <m:t>L</m:t>
+                </m:r>
+              </m:e>
+              <m:sup>
+                <m:r>
+                  <m:t>2</m:t>
+                </m:r>
+              </m:sup>
+            </m:sSup>
+          </m:sub>
+        </m:sSub>
+      </m:oMath>
+      <w:r>
+        <w:t xml:space="preserve">, where</w:t>
+      </w:r>
+      <w:r>
+        <w:t xml:space="preserve"> </w:t>
+      </w:r>
+      <m:oMath>
+        <m:sSub>
+          <m:e>
+            <m:r>
+              <m:rPr>
+                <m:sty m:val="p"/>
+              </m:rPr>
+              <m:t>Δ</m:t>
+            </m:r>
+          </m:e>
+          <m:sub>
+            <m:r>
+              <m:t>m</m:t>
+            </m:r>
+          </m:sub>
+        </m:sSub>
+      </m:oMath>
+      <w:r>
+        <w:t xml:space="preserve"> </w:t>
+      </w:r>
+      <w:r>
+        <w:t xml:space="preserve">is the mesh width. The union of</w:t>
+      </w:r>
+      <w:r>
+        <w:t xml:space="preserve"> </w:t>
+      </w:r>
+      <m:oMath>
+        <m:sSub>
+          <m:e>
+            <m:r>
+              <m:t>V</m:t>
+            </m:r>
+          </m:e>
+          <m:sub>
+            <m:r>
+              <m:t>m</m:t>
+            </m:r>
+          </m:sub>
+        </m:sSub>
+      </m:oMath>
+      <w:r>
+        <w:t xml:space="preserve"> </w:t>
+      </w:r>
+      <w:r>
+        <w:t xml:space="preserve">is therefore dense in</w:t>
+      </w:r>
+      <w:r>
+        <w:t xml:space="preserve"> </w:t>
+      </w:r>
+      <m:oMath>
+        <m:sSubSup>
+          <m:e>
+            <m:r>
+              <m:t>H</m:t>
+            </m:r>
+          </m:e>
+          <m:sub>
+            <m:r>
+              <m:t>0</m:t>
+            </m:r>
+          </m:sub>
+          <m:sup>
+            <m:r>
+              <m:t>1</m:t>
+            </m:r>
+          </m:sup>
+        </m:sSubSup>
+      </m:oMath>
+      <w:r>
+        <w:t xml:space="preserve">. Continuity of</w:t>
+      </w:r>
+      <w:r>
+        <w:t xml:space="preserve"> </w:t>
+      </w:r>
+      <m:oMath>
+        <m:sSup>
+          <m:e>
+            <m:r>
+              <m:rPr>
+                <m:scr m:val="script"/>
+                <m:sty m:val="p"/>
+              </m:rPr>
+              <m:t>D</m:t>
+            </m:r>
+          </m:e>
+          <m:sup>
+            <m:r>
+              <m:rPr>
+                <m:sty m:val="p"/>
+              </m:rPr>
+              <m:t>*</m:t>
+            </m:r>
+          </m:sup>
+        </m:sSup>
+        <m:r>
+          <m:rPr>
+            <m:sty m:val="p"/>
+          </m:rPr>
+          <m:t>:</m:t>
+        </m:r>
+        <m:sSubSup>
+          <m:e>
+            <m:r>
+              <m:t>H</m:t>
+            </m:r>
+          </m:e>
+          <m:sub>
+            <m:r>
+              <m:t>0</m:t>
+            </m:r>
+          </m:sub>
+          <m:sup>
+            <m:r>
+              <m:t>1</m:t>
+            </m:r>
+          </m:sup>
+        </m:sSubSup>
+        <m:r>
+          <m:rPr>
+            <m:sty m:val="p"/>
+          </m:rPr>
+          <m:t>→</m:t>
+        </m:r>
+        <m:sSup>
+          <m:e>
+            <m:r>
+              <m:t>L</m:t>
+            </m:r>
+          </m:e>
+          <m:sup>
+            <m:r>
+              <m:t>2</m:t>
+            </m:r>
+          </m:sup>
+        </m:sSup>
+      </m:oMath>
+      <w:r>
+        <w:t xml:space="preserve"> </w:t>
+      </w:r>
+      <w:r>
+        <w:t xml:space="preserve">and of the embedding</w:t>
+      </w:r>
+      <w:r>
+        <w:t xml:space="preserve"> </w:t>
+      </w:r>
+      <m:oMath>
+        <m:sSup>
+          <m:e>
+            <m:r>
+              <m:t>L</m:t>
+            </m:r>
+          </m:e>
+          <m:sup>
+            <m:r>
+              <m:t>2</m:t>
+            </m:r>
+          </m:sup>
+        </m:sSup>
+        <m:r>
+          <m:rPr>
+            <m:sty m:val="p"/>
+          </m:rPr>
+          <m:t>↪</m:t>
+        </m:r>
+        <m:sSup>
+          <m:e>
+            <m:r>
+              <m:rPr>
+                <m:scr m:val="script"/>
+                <m:sty m:val="p"/>
+              </m:rPr>
+              <m:t>H</m:t>
+            </m:r>
+          </m:e>
+          <m:sup>
+            <m:r>
+              <m:rPr>
+                <m:sty m:val="p"/>
+              </m:rPr>
+              <m:t>′</m:t>
+            </m:r>
+          </m:sup>
+        </m:sSup>
+      </m:oMath>
+      <w:r>
+        <w:t xml:space="preserve"> </w:t>
+      </w:r>
+      <w:r>
+        <w:t xml:space="preserve">transfers this approximation to the covariance norm. Proposition 2 identifies the closure of</w:t>
+      </w:r>
+      <w:r>
+        <w:t xml:space="preserve"> </w:t>
+      </w:r>
+      <m:oMath>
+        <m:sSup>
+          <m:e>
+            <m:r>
+              <m:rPr>
+                <m:scr m:val="script"/>
+                <m:sty m:val="p"/>
+              </m:rPr>
+              <m:t>D</m:t>
+            </m:r>
+          </m:e>
+          <m:sup>
+            <m:r>
+              <m:rPr>
+                <m:sty m:val="p"/>
+              </m:rPr>
+              <m:t>*</m:t>
+            </m:r>
+          </m:sup>
+        </m:sSup>
+        <m:sSubSup>
+          <m:e>
+            <m:r>
+              <m:t>H</m:t>
+            </m:r>
+          </m:e>
+          <m:sub>
+            <m:r>
+              <m:t>0</m:t>
+            </m:r>
+          </m:sub>
+          <m:sup>
+            <m:r>
+              <m:t>1</m:t>
+            </m:r>
+          </m:sup>
+        </m:sSubSup>
+      </m:oMath>
+      <w:r>
+        <w:t xml:space="preserve"> </w:t>
+      </w:r>
+      <w:r>
+        <w:t xml:space="preserve">with</w:t>
+      </w:r>
+      <w:r>
+        <w:t xml:space="preserve"> </w:t>
+      </w:r>
+      <m:oMath>
+        <m:r>
+          <m:rPr>
+            <m:scr m:val="script"/>
+            <m:sty m:val="p"/>
+          </m:rPr>
+          <m:t>M</m:t>
+        </m:r>
+      </m:oMath>
+      <w:r>
+        <w:t xml:space="preserve">.</w:t>
+      </w:r>
+      <w:r>
+        <w:t xml:space="preserve"> </w:t>
+      </w:r>
+      <m:oMath>
+        <m:r>
+          <m:rPr>
+            <m:sty m:val="p"/>
+          </m:rPr>
+          <m:t>▫</m:t>
+        </m:r>
+      </m:oMath>
+    </w:p>
+    <w:p>
+      <w:pPr>
+        <w:pStyle w:val="BodyText"/>
+      </w:pPr>
+      <w:r>
+        <w:t xml:space="preserve">These splines are admissible zero-endpoint Sobolev tests; they need not vanish in an endpoint neighborhood. If literal smooth compact tests are required, approximate each spline in</w:t>
+      </w:r>
+      <w:r>
+        <w:t xml:space="preserve"> </w:t>
+      </w:r>
+      <m:oMath>
+        <m:sSubSup>
+          <m:e>
+            <m:r>
+              <m:t>H</m:t>
+            </m:r>
+          </m:e>
+          <m:sub>
+            <m:r>
+              <m:t>0</m:t>
+            </m:r>
+          </m:sub>
+          <m:sup>
+            <m:r>
+              <m:t>1</m:t>
+            </m:r>
+          </m:sup>
+        </m:sSubSup>
+      </m:oMath>
+      <w:r>
+        <w:t xml:space="preserve"> </w:t>
+      </w:r>
+      <w:r>
+        <w:t xml:space="preserve">by such tests. Thus Lemma 1 provides an explicit family for the density condition in Corollary 1. It does not assert density of the finite multiscale bump families used in the experiments.</w:t>
       </w:r>
     </w:p>
     <w:bookmarkEnd w:id="9"/>
@@ -3166,27 +4037,7 @@
         <w:pStyle w:val="BodyText"/>
       </w:pPr>
       <w:r>
-        <w:t xml:space="preserve">This is a matrix statement. Dividing a vector influence by a scalar information is valid only when</w:t>
-      </w:r>
-      <w:r>
-        <w:t xml:space="preserve"> </w:t>
-      </w:r>
-      <m:oMath>
-        <m:r>
-          <m:t>p</m:t>
-        </m:r>
-        <m:r>
-          <m:rPr>
-            <m:sty m:val="p"/>
-          </m:rPr>
-          <m:t>=</m:t>
-        </m:r>
-        <m:r>
-          <m:t>1</m:t>
-        </m:r>
-      </m:oMath>
-      <w:r>
-        <w:t xml:space="preserve">. The information loss is exactly</w:t>
+        <w:t xml:space="preserve">For an unknown initial state,</w:t>
       </w:r>
       <w:r>
         <w:t xml:space="preserve"> </w:t>
@@ -3204,14 +4055,22 @@
           </m:e>
           <m:sub>
             <m:r>
-              <m:t>θ</m:t>
-            </m:r>
-            <m:r>
-              <m:t>u</m:t>
+              <m:t>e</m:t>
             </m:r>
           </m:sub>
         </m:sSub>
-        <m:sSubSup>
+      </m:oMath>
+      <w:r>
+        <w:t xml:space="preserve"> </w:t>
+      </w:r>
+      <w:r>
+        <w:t xml:space="preserve">is the full likelihood nuisance-adjusted information, so this weak restriction has no further first-order cost. When the initial state is known, the information loss is exactly</w:t>
+      </w:r>
+      <w:r>
+        <w:t xml:space="preserve"> </w:t>
+      </w:r>
+      <m:oMath>
+        <m:sSub>
           <m:e>
             <m:r>
               <m:rPr>
@@ -3223,25 +4082,14 @@
           </m:e>
           <m:sub>
             <m:r>
+              <m:t>θ</m:t>
+            </m:r>
+            <m:r>
               <m:t>u</m:t>
             </m:r>
-            <m:r>
-              <m:t>u</m:t>
-            </m:r>
           </m:sub>
-          <m:sup>
-            <m:r>
-              <m:rPr>
-                <m:sty m:val="p"/>
-              </m:rPr>
-              <m:t>−</m:t>
-            </m:r>
-            <m:r>
-              <m:t>1</m:t>
-            </m:r>
-          </m:sup>
-        </m:sSubSup>
-        <m:sSub>
+        </m:sSub>
+        <m:sSubSup>
           <m:e>
             <m:r>
               <m:rPr>
@@ -3256,19 +4104,22 @@
               <m:t>u</m:t>
             </m:r>
             <m:r>
-              <m:t>θ</m:t>
+              <m:t>u</m:t>
             </m:r>
           </m:sub>
-        </m:sSub>
-      </m:oMath>
-      <w:r>
-        <w:t xml:space="preserve">; covariance inflation is</w:t>
-      </w:r>
-      <w:r>
-        <w:t xml:space="preserve"> </w:t>
-      </w:r>
-      <m:oMath>
-        <m:sSubSup>
+          <m:sup>
+            <m:r>
+              <m:rPr>
+                <m:sty m:val="p"/>
+              </m:rPr>
+              <m:t>−</m:t>
+            </m:r>
+            <m:r>
+              <m:t>1</m:t>
+            </m:r>
+          </m:sup>
+        </m:sSubSup>
+        <m:sSub>
           <m:e>
             <m:r>
               <m:rPr>
@@ -3280,27 +4131,21 @@
           </m:e>
           <m:sub>
             <m:r>
-              <m:t>e</m:t>
+              <m:t>u</m:t>
+            </m:r>
+            <m:r>
+              <m:t>θ</m:t>
             </m:r>
           </m:sub>
-          <m:sup>
-            <m:r>
-              <m:rPr>
-                <m:sty m:val="p"/>
-              </m:rPr>
-              <m:t>−</m:t>
-            </m:r>
-            <m:r>
-              <m:t>1</m:t>
-            </m:r>
-          </m:sup>
-        </m:sSubSup>
-        <m:r>
-          <m:rPr>
-            <m:sty m:val="p"/>
-          </m:rPr>
-          <m:t>−</m:t>
-        </m:r>
+        </m:sSub>
+      </m:oMath>
+      <w:r>
+        <w:t xml:space="preserve">; covariance inflation is</w:t>
+      </w:r>
+      <w:r>
+        <w:t xml:space="preserve"> </w:t>
+      </w:r>
+      <m:oMath>
         <m:sSubSup>
           <m:e>
             <m:r>
@@ -3313,10 +4158,7 @@
           </m:e>
           <m:sub>
             <m:r>
-              <m:t>θ</m:t>
-            </m:r>
-            <m:r>
-              <m:t>θ</m:t>
+              <m:t>e</m:t>
             </m:r>
           </m:sub>
           <m:sup>
@@ -3331,9 +4173,97 @@
             </m:r>
           </m:sup>
         </m:sSubSup>
-      </m:oMath>
-      <w:r>
-        <w:t xml:space="preserve">. There is no direction-independent scalar loss percentage in general.</w:t>
+        <m:r>
+          <m:rPr>
+            <m:sty m:val="p"/>
+          </m:rPr>
+          <m:t>−</m:t>
+        </m:r>
+        <m:sSubSup>
+          <m:e>
+            <m:r>
+              <m:rPr>
+                <m:scr m:val="script"/>
+                <m:sty m:val="p"/>
+              </m:rPr>
+              <m:t>I</m:t>
+            </m:r>
+          </m:e>
+          <m:sub>
+            <m:r>
+              <m:t>θ</m:t>
+            </m:r>
+            <m:r>
+              <m:t>θ</m:t>
+            </m:r>
+          </m:sub>
+          <m:sup>
+            <m:r>
+              <m:rPr>
+                <m:sty m:val="p"/>
+              </m:rPr>
+              <m:t>−</m:t>
+            </m:r>
+            <m:r>
+              <m:t>1</m:t>
+            </m:r>
+          </m:sup>
+        </m:sSubSup>
+      </m:oMath>
+      <w:r>
+        <w:t xml:space="preserve">. There is no direction-independent scalar loss percentage in general. When</w:t>
+      </w:r>
+      <w:r>
+        <w:t xml:space="preserve"> </w:t>
+      </w:r>
+      <m:oMath>
+        <m:r>
+          <m:t>u</m:t>
+        </m:r>
+      </m:oMath>
+      <w:r>
+        <w:t xml:space="preserve"> </w:t>
+      </w:r>
+      <w:r>
+        <w:t xml:space="preserve">is known,</w:t>
+      </w:r>
+      <w:r>
+        <w:t xml:space="preserve"> </w:t>
+      </w:r>
+      <m:oMath>
+        <m:r>
+          <m:t>Y</m:t>
+        </m:r>
+        <m:r>
+          <m:rPr>
+            <m:sty m:val="p"/>
+          </m:rPr>
+          <m:t>(</m:t>
+        </m:r>
+        <m:r>
+          <m:t>0</m:t>
+        </m:r>
+        <m:r>
+          <m:rPr>
+            <m:sty m:val="p"/>
+          </m:rPr>
+          <m:t>)</m:t>
+        </m:r>
+        <m:r>
+          <m:rPr>
+            <m:sty m:val="p"/>
+          </m:rPr>
+          <m:t>−</m:t>
+        </m:r>
+        <m:r>
+          <m:t>u</m:t>
+        </m:r>
+      </m:oMath>
+      <w:r>
+        <w:t xml:space="preserve"> </w:t>
+      </w:r>
+      <w:r>
+        <w:t xml:space="preserve">also reveals the initial stationary measurement error, which remains correlated with later observations. The unrestricted score can exploit that observation while the weak influence must retain its initial-sensitivity annihilation constraint.</w:t>
       </w:r>
     </w:p>
     <w:bookmarkEnd w:id="10"/>
@@ -4264,7 +5194,11 @@
         <m:sSup>
           <m:e>
             <m:r>
-              <m:t>A</m:t>
+              <m:rPr>
+                <m:scr m:val="script"/>
+                <m:sty m:val="p"/>
+              </m:rPr>
+              <m:t>D</m:t>
             </m:r>
           </m:e>
           <m:sup>
@@ -5636,7 +6570,11 @@
         <m:sSup>
           <m:e>
             <m:r>
-              <m:t>A</m:t>
+              <m:rPr>
+                <m:scr m:val="script"/>
+                <m:sty m:val="p"/>
+              </m:rPr>
+              <m:t>D</m:t>
             </m:r>
           </m:e>
           <m:sup>
@@ -6065,6 +7003,705 @@
         <w:pStyle w:val="BodyText"/>
       </w:pPr>
       <w:r>
+        <w:t xml:space="preserve">The same leading map arises from a parameter-dependent Gaussian weak likelihood of the form studied by WENDy-MLE</w:t>
+      </w:r>
+      <w:r>
+        <w:t xml:space="preserve"> </w:t>
+      </w:r>
+      <w:r>
+        <w:t xml:space="preserve">[3]</w:t>
+      </w:r>
+      <w:r>
+        <w:t xml:space="preserve">, provided the covariance shape is correct and the local solution is regular. For fixed dimension write</w:t>
+      </w:r>
+      <w:r>
+        <w:t xml:space="preserve"> </w:t>
+      </w:r>
+      <m:oMath>
+        <m:r>
+          <m:t>r</m:t>
+        </m:r>
+        <m:r>
+          <m:rPr>
+            <m:sty m:val="p"/>
+          </m:rPr>
+          <m:t>(</m:t>
+        </m:r>
+        <m:r>
+          <m:t>θ</m:t>
+        </m:r>
+        <m:r>
+          <m:rPr>
+            <m:sty m:val="p"/>
+          </m:rPr>
+          <m:t>)</m:t>
+        </m:r>
+        <m:r>
+          <m:rPr>
+            <m:sty m:val="p"/>
+          </m:rPr>
+          <m:t>=</m:t>
+        </m:r>
+        <m:r>
+          <m:t>ϵ</m:t>
+        </m:r>
+        <m:sSub>
+          <m:e>
+            <m:r>
+              <m:t>r</m:t>
+            </m:r>
+          </m:e>
+          <m:sub>
+            <m:r>
+              <m:t>1</m:t>
+            </m:r>
+          </m:sub>
+        </m:sSub>
+        <m:r>
+          <m:rPr>
+            <m:sty m:val="p"/>
+          </m:rPr>
+          <m:t>+</m:t>
+        </m:r>
+        <m:sSub>
+          <m:e>
+            <m:r>
+              <m:t>o</m:t>
+            </m:r>
+          </m:e>
+          <m:sub>
+            <m:r>
+              <m:t>p</m:t>
+            </m:r>
+          </m:sub>
+        </m:sSub>
+        <m:r>
+          <m:rPr>
+            <m:sty m:val="p"/>
+          </m:rPr>
+          <m:t>(</m:t>
+        </m:r>
+        <m:r>
+          <m:t>ϵ</m:t>
+        </m:r>
+        <m:r>
+          <m:rPr>
+            <m:sty m:val="p"/>
+          </m:rPr>
+          <m:t>)</m:t>
+        </m:r>
+      </m:oMath>
+      <w:r>
+        <w:t xml:space="preserve">,</w:t>
+      </w:r>
+      <w:r>
+        <w:t xml:space="preserve"> </w:t>
+      </w:r>
+      <m:oMath>
+        <m:sSub>
+          <m:e>
+            <m:r>
+              <m:rPr>
+                <m:sty m:val="p"/>
+              </m:rPr>
+              <m:t>∂</m:t>
+            </m:r>
+          </m:e>
+          <m:sub>
+            <m:r>
+              <m:t>θ</m:t>
+            </m:r>
+          </m:sub>
+        </m:sSub>
+        <m:r>
+          <m:t>r</m:t>
+        </m:r>
+        <m:r>
+          <m:rPr>
+            <m:sty m:val="p"/>
+          </m:rPr>
+          <m:t>=</m:t>
+        </m:r>
+        <m:r>
+          <m:rPr>
+            <m:sty m:val="p"/>
+          </m:rPr>
+          <m:t>−</m:t>
+        </m:r>
+        <m:r>
+          <m:t>D</m:t>
+        </m:r>
+        <m:r>
+          <m:rPr>
+            <m:sty m:val="p"/>
+          </m:rPr>
+          <m:t>+</m:t>
+        </m:r>
+        <m:sSub>
+          <m:e>
+            <m:r>
+              <m:t>o</m:t>
+            </m:r>
+          </m:e>
+          <m:sub>
+            <m:r>
+              <m:t>p</m:t>
+            </m:r>
+          </m:sub>
+        </m:sSub>
+        <m:r>
+          <m:rPr>
+            <m:sty m:val="p"/>
+          </m:rPr>
+          <m:t>(</m:t>
+        </m:r>
+        <m:r>
+          <m:t>1</m:t>
+        </m:r>
+        <m:r>
+          <m:rPr>
+            <m:sty m:val="p"/>
+          </m:rPr>
+          <m:t>)</m:t>
+        </m:r>
+      </m:oMath>
+      <w:r>
+        <w:t xml:space="preserve"> </w:t>
+      </w:r>
+      <w:r>
+        <w:t xml:space="preserve">and</w:t>
+      </w:r>
+      <w:r>
+        <w:t xml:space="preserve"> </w:t>
+      </w:r>
+      <m:oMath>
+        <m:sSub>
+          <m:e>
+            <m:r>
+              <m:rPr>
+                <m:sty m:val="p"/>
+              </m:rPr>
+              <m:t>Σ</m:t>
+            </m:r>
+          </m:e>
+          <m:sub>
+            <m:r>
+              <m:t>ϵ</m:t>
+            </m:r>
+          </m:sub>
+        </m:sSub>
+        <m:r>
+          <m:rPr>
+            <m:sty m:val="p"/>
+          </m:rPr>
+          <m:t>(</m:t>
+        </m:r>
+        <m:r>
+          <m:t>θ</m:t>
+        </m:r>
+        <m:r>
+          <m:rPr>
+            <m:sty m:val="p"/>
+          </m:rPr>
+          <m:t>)</m:t>
+        </m:r>
+        <m:r>
+          <m:rPr>
+            <m:sty m:val="p"/>
+          </m:rPr>
+          <m:t>=</m:t>
+        </m:r>
+        <m:sSup>
+          <m:e>
+            <m:r>
+              <m:t>ϵ</m:t>
+            </m:r>
+          </m:e>
+          <m:sup>
+            <m:r>
+              <m:t>2</m:t>
+            </m:r>
+          </m:sup>
+        </m:sSup>
+        <m:sSub>
+          <m:e>
+            <m:r>
+              <m:rPr>
+                <m:sty m:val="p"/>
+              </m:rPr>
+              <m:t>Σ</m:t>
+            </m:r>
+          </m:e>
+          <m:sub>
+            <m:r>
+              <m:t>0</m:t>
+            </m:r>
+          </m:sub>
+        </m:sSub>
+        <m:r>
+          <m:rPr>
+            <m:sty m:val="p"/>
+          </m:rPr>
+          <m:t>(</m:t>
+        </m:r>
+        <m:r>
+          <m:t>θ</m:t>
+        </m:r>
+        <m:r>
+          <m:rPr>
+            <m:sty m:val="p"/>
+          </m:rPr>
+          <m:t>)</m:t>
+        </m:r>
+      </m:oMath>
+      <w:r>
+        <w:t xml:space="preserve">, with smooth positive definite</w:t>
+      </w:r>
+      <w:r>
+        <w:t xml:space="preserve"> </w:t>
+      </w:r>
+      <m:oMath>
+        <m:sSub>
+          <m:e>
+            <m:r>
+              <m:rPr>
+                <m:sty m:val="p"/>
+              </m:rPr>
+              <m:t>Σ</m:t>
+            </m:r>
+          </m:e>
+          <m:sub>
+            <m:r>
+              <m:t>0</m:t>
+            </m:r>
+          </m:sub>
+        </m:sSub>
+      </m:oMath>
+      <w:r>
+        <w:t xml:space="preserve">. The objective</w:t>
+      </w:r>
+      <w:r>
+        <w:t xml:space="preserve"> </w:t>
+      </w:r>
+      <m:oMath>
+        <m:r>
+          <m:rPr>
+            <m:sty m:val="p"/>
+          </m:rPr>
+          <m:t>log</m:t>
+        </m:r>
+        <m:r>
+          <m:rPr>
+            <m:sty m:val="p"/>
+          </m:rPr>
+          <m:t>det</m:t>
+        </m:r>
+        <m:sSub>
+          <m:e>
+            <m:r>
+              <m:rPr>
+                <m:sty m:val="p"/>
+              </m:rPr>
+              <m:t>Σ</m:t>
+            </m:r>
+          </m:e>
+          <m:sub>
+            <m:r>
+              <m:t>ϵ</m:t>
+            </m:r>
+          </m:sub>
+        </m:sSub>
+        <m:r>
+          <m:rPr>
+            <m:sty m:val="p"/>
+          </m:rPr>
+          <m:t>+</m:t>
+        </m:r>
+        <m:sSup>
+          <m:e>
+            <m:r>
+              <m:t>r</m:t>
+            </m:r>
+          </m:e>
+          <m:sup>
+            <m:r>
+              <m:t>T</m:t>
+            </m:r>
+          </m:sup>
+        </m:sSup>
+        <m:sSubSup>
+          <m:e>
+            <m:r>
+              <m:rPr>
+                <m:sty m:val="p"/>
+              </m:rPr>
+              <m:t>Σ</m:t>
+            </m:r>
+          </m:e>
+          <m:sub>
+            <m:r>
+              <m:t>ϵ</m:t>
+            </m:r>
+          </m:sub>
+          <m:sup>
+            <m:r>
+              <m:rPr>
+                <m:sty m:val="p"/>
+              </m:rPr>
+              <m:t>−</m:t>
+            </m:r>
+            <m:r>
+              <m:t>1</m:t>
+            </m:r>
+          </m:sup>
+        </m:sSubSup>
+        <m:r>
+          <m:t>r</m:t>
+        </m:r>
+      </m:oMath>
+      <w:r>
+        <w:t xml:space="preserve"> </w:t>
+      </w:r>
+      <w:r>
+        <w:t xml:space="preserve">has covariance-derivative and log-determinant score terms of order</w:t>
+      </w:r>
+      <w:r>
+        <w:t xml:space="preserve"> </w:t>
+      </w:r>
+      <m:oMath>
+        <m:sSub>
+          <m:e>
+            <m:r>
+              <m:t>O</m:t>
+            </m:r>
+          </m:e>
+          <m:sub>
+            <m:r>
+              <m:t>p</m:t>
+            </m:r>
+          </m:sub>
+        </m:sSub>
+        <m:r>
+          <m:rPr>
+            <m:sty m:val="p"/>
+          </m:rPr>
+          <m:t>(</m:t>
+        </m:r>
+        <m:r>
+          <m:t>1</m:t>
+        </m:r>
+        <m:r>
+          <m:rPr>
+            <m:sty m:val="p"/>
+          </m:rPr>
+          <m:t>)</m:t>
+        </m:r>
+      </m:oMath>
+      <w:r>
+        <w:t xml:space="preserve"> </w:t>
+      </w:r>
+      <w:r>
+        <w:t xml:space="preserve">in an</w:t>
+      </w:r>
+      <w:r>
+        <w:t xml:space="preserve"> </w:t>
+      </w:r>
+      <m:oMath>
+        <m:sSub>
+          <m:e>
+            <m:r>
+              <m:t>O</m:t>
+            </m:r>
+          </m:e>
+          <m:sub>
+            <m:r>
+              <m:t>p</m:t>
+            </m:r>
+          </m:sub>
+        </m:sSub>
+        <m:r>
+          <m:rPr>
+            <m:sty m:val="p"/>
+          </m:rPr>
+          <m:t>(</m:t>
+        </m:r>
+        <m:r>
+          <m:t>ϵ</m:t>
+        </m:r>
+        <m:r>
+          <m:rPr>
+            <m:sty m:val="p"/>
+          </m:rPr>
+          <m:t>)</m:t>
+        </m:r>
+      </m:oMath>
+      <w:r>
+        <w:t xml:space="preserve"> </w:t>
+      </w:r>
+      <w:r>
+        <w:t xml:space="preserve">neighborhood; its mean-residual score is of order</w:t>
+      </w:r>
+      <w:r>
+        <w:t xml:space="preserve"> </w:t>
+      </w:r>
+      <m:oMath>
+        <m:sSub>
+          <m:e>
+            <m:r>
+              <m:t>O</m:t>
+            </m:r>
+          </m:e>
+          <m:sub>
+            <m:r>
+              <m:t>p</m:t>
+            </m:r>
+          </m:sub>
+        </m:sSub>
+        <m:r>
+          <m:rPr>
+            <m:sty m:val="p"/>
+          </m:rPr>
+          <m:t>(</m:t>
+        </m:r>
+        <m:sSup>
+          <m:e>
+            <m:r>
+              <m:t>ϵ</m:t>
+            </m:r>
+          </m:e>
+          <m:sup>
+            <m:r>
+              <m:rPr>
+                <m:sty m:val="p"/>
+              </m:rPr>
+              <m:t>−</m:t>
+            </m:r>
+            <m:r>
+              <m:t>1</m:t>
+            </m:r>
+          </m:sup>
+        </m:sSup>
+        <m:r>
+          <m:rPr>
+            <m:sty m:val="p"/>
+          </m:rPr>
+          <m:t>)</m:t>
+        </m:r>
+      </m:oMath>
+      <w:r>
+        <w:t xml:space="preserve">. The local score equation therefore gives</w:t>
+      </w:r>
+    </w:p>
+    <w:p>
+      <w:pPr>
+        <w:pStyle w:val="BodyText"/>
+      </w:pPr>
+      <m:oMathPara>
+        <m:oMathParaPr>
+          <m:jc m:val="center"/>
+        </m:oMathParaPr>
+        <m:oMath>
+          <m:acc>
+            <m:accPr>
+              <m:chr m:val="̂"/>
+            </m:accPr>
+            <m:e>
+              <m:r>
+                <m:t>θ</m:t>
+              </m:r>
+            </m:e>
+          </m:acc>
+          <m:r>
+            <m:rPr>
+              <m:sty m:val="p"/>
+            </m:rPr>
+            <m:t>−</m:t>
+          </m:r>
+          <m:r>
+            <m:t>θ</m:t>
+          </m:r>
+          <m:r>
+            <m:rPr>
+              <m:sty m:val="p"/>
+            </m:rPr>
+            <m:t>=</m:t>
+          </m:r>
+          <m:r>
+            <m:t>ϵ</m:t>
+          </m:r>
+          <m:r>
+            <m:rPr>
+              <m:sty m:val="p"/>
+            </m:rPr>
+            <m:t>(</m:t>
+          </m:r>
+          <m:sSup>
+            <m:e>
+              <m:r>
+                <m:t>D</m:t>
+              </m:r>
+            </m:e>
+            <m:sup>
+              <m:r>
+                <m:t>T</m:t>
+              </m:r>
+            </m:sup>
+          </m:sSup>
+          <m:sSubSup>
+            <m:e>
+              <m:r>
+                <m:rPr>
+                  <m:sty m:val="p"/>
+                </m:rPr>
+                <m:t>Σ</m:t>
+              </m:r>
+            </m:e>
+            <m:sub>
+              <m:r>
+                <m:t>0</m:t>
+              </m:r>
+            </m:sub>
+            <m:sup>
+              <m:r>
+                <m:rPr>
+                  <m:sty m:val="p"/>
+                </m:rPr>
+                <m:t>−</m:t>
+              </m:r>
+              <m:r>
+                <m:t>1</m:t>
+              </m:r>
+            </m:sup>
+          </m:sSubSup>
+          <m:r>
+            <m:t>D</m:t>
+          </m:r>
+          <m:sSup>
+            <m:e>
+              <m:r>
+                <m:rPr>
+                  <m:sty m:val="p"/>
+                </m:rPr>
+                <m:t>)</m:t>
+              </m:r>
+            </m:e>
+            <m:sup>
+              <m:r>
+                <m:rPr>
+                  <m:sty m:val="p"/>
+                </m:rPr>
+                <m:t>−</m:t>
+              </m:r>
+              <m:r>
+                <m:t>1</m:t>
+              </m:r>
+            </m:sup>
+          </m:sSup>
+          <m:sSup>
+            <m:e>
+              <m:r>
+                <m:t>D</m:t>
+              </m:r>
+            </m:e>
+            <m:sup>
+              <m:r>
+                <m:t>T</m:t>
+              </m:r>
+            </m:sup>
+          </m:sSup>
+          <m:sSubSup>
+            <m:e>
+              <m:r>
+                <m:rPr>
+                  <m:sty m:val="p"/>
+                </m:rPr>
+                <m:t>Σ</m:t>
+              </m:r>
+            </m:e>
+            <m:sub>
+              <m:r>
+                <m:t>0</m:t>
+              </m:r>
+            </m:sub>
+            <m:sup>
+              <m:r>
+                <m:rPr>
+                  <m:sty m:val="p"/>
+                </m:rPr>
+                <m:t>−</m:t>
+              </m:r>
+              <m:r>
+                <m:t>1</m:t>
+              </m:r>
+            </m:sup>
+          </m:sSubSup>
+          <m:sSub>
+            <m:e>
+              <m:r>
+                <m:t>r</m:t>
+              </m:r>
+            </m:e>
+            <m:sub>
+              <m:r>
+                <m:t>1</m:t>
+              </m:r>
+            </m:sub>
+          </m:sSub>
+          <m:r>
+            <m:rPr>
+              <m:sty m:val="p"/>
+            </m:rPr>
+            <m:t>+</m:t>
+          </m:r>
+          <m:sSub>
+            <m:e>
+              <m:r>
+                <m:t>o</m:t>
+              </m:r>
+            </m:e>
+            <m:sub>
+              <m:r>
+                <m:t>p</m:t>
+              </m:r>
+            </m:sub>
+          </m:sSub>
+          <m:r>
+            <m:rPr>
+              <m:sty m:val="p"/>
+            </m:rPr>
+            <m:t>(</m:t>
+          </m:r>
+          <m:r>
+            <m:t>ϵ</m:t>
+          </m:r>
+          <m:r>
+            <m:rPr>
+              <m:sty m:val="p"/>
+            </m:rPr>
+            <m:t>)</m:t>
+          </m:r>
+          <m:r>
+            <m:rPr>
+              <m:sty m:val="p"/>
+            </m:rPr>
+            <m:t>.</m:t>
+          </m:r>
+        </m:oMath>
+      </m:oMathPara>
+    </w:p>
+    <w:p>
+      <w:pPr>
+        <w:pStyle w:val="FirstParagraph"/>
+      </w:pPr>
+      <w:r>
+        <w:t xml:space="preserve">Thus the log determinant and covariance derivatives distinguish finite-noise weak likelihood from frozen GLS, while both share the correct-covariance leading influence under these assumptions. This connects Corollary 1 to a regular local weak-likelihood estimator; it does not supply global optimization or covariance-calibration consistency for a released implementation.</w:t>
+      </w:r>
+    </w:p>
+    <w:p>
+      <w:pPr>
+        <w:pStyle w:val="BodyText"/>
+      </w:pPr>
+      <w:r>
         <w:rPr>
           <w:b/>
           <w:bCs/>
@@ -6087,7 +7724,7 @@
         <m:sSub>
           <m:e>
             <m:r>
-              <m:t>Z</m:t>
+              <m:t>η</m:t>
             </m:r>
           </m:e>
           <m:sub>
@@ -6234,7 +7871,7 @@
         </m:sSup>
       </m:oMath>
       <w:r>
-        <w:t xml:space="preserve">. A sufficient implementation uses a uniformly stable smooth local solve, Gaussian moment control on the local Taylor remainder, and bounded fallback outside the regular region whose probability is</w:t>
+        <w:t xml:space="preserve">. A sufficient implementation uses a uniformly stable smooth local solve, Gaussian moment control on the local Taylor remainder, and bounded fallback outside the regular region on a bad event whose probability is</w:t>
       </w:r>
       <w:r>
         <w:t xml:space="preserve"> </w:t>
@@ -6834,11 +8471,11 @@
         </m:r>
       </m:oMath>
       <w:r>
-        <w:t xml:space="preserve">, then dense spans. A diagonal joint limit requires uniform remainder, conditioning and covariance-weight control that are not supplied here. This theorem concerns regular WENDy-like weak estimation with correct covariance and supplied identifiable structure, not all implementations called WENDy, finite-noise sparse selection, or a universal plateau for misspecified iid weighting. A fixed basis cutoff must be compatible with the density assumption; discarding an informative direction permanently can invalidate it.</w:t>
+        <w:t xml:space="preserve">, then dense spans. A diagonal joint limit requires uniform remainder, conditioning and covariance-weight control that are not supplied here. This theorem concerns regular WENDy-like weak estimation with correct covariance and supplied identifiable structure. The conditional result covers the leading GLS map, rather than an algorithm name or finite-noise support-selection procedure. A fixed basis cutoff must be compatible with the density assumption; discarding an informative direction permanently can invalidate it.</w:t>
       </w:r>
     </w:p>
     <w:bookmarkEnd w:id="12"/>
-    <w:bookmarkStart w:id="18" w:name="references"/>
+    <w:bookmarkStart w:id="20" w:name="references"/>
     <w:p>
       <w:pPr>
         <w:pStyle w:val="Heading2"/>
@@ -6847,7 +8484,7 @@
         <w:t xml:space="preserve">References</w:t>
       </w:r>
     </w:p>
-    <w:bookmarkStart w:id="17" w:name="refs"/>
+    <w:bookmarkStart w:id="19" w:name="refs"/>
     <w:bookmarkStart w:id="14" w:name="ref-dette2016"/>
     <w:p>
       <w:pPr>
@@ -6967,8 +8604,65 @@
       </w:r>
     </w:p>
     <w:bookmarkEnd w:id="16"/>
-    <w:bookmarkEnd w:id="17"/>
+    <w:bookmarkStart w:id="18" w:name="ref-rummel2025"/>
+    <w:p>
+      <w:pPr>
+        <w:pStyle w:val="Bibliography"/>
+      </w:pPr>
+      <w:r>
+        <w:t xml:space="preserve">[3]</w:t>
+      </w:r>
+      <w:r>
+        <w:t xml:space="preserve"> </w:t>
+      </w:r>
+      <w:r>
+        <w:t xml:space="preserve">	</w:t>
+      </w:r>
+      <w:r>
+        <w:t xml:space="preserve">Rummel N, Messenger DA, Becker S, Dukic V, Bortz DM.</w:t>
+      </w:r>
+      <w:r>
+        <w:t xml:space="preserve"> </w:t>
+      </w:r>
+      <w:hyperlink r:id="rId17">
+        <w:r>
+          <w:rPr>
+            <w:rStyle w:val="Hyperlink"/>
+          </w:rPr>
+          <w:t xml:space="preserve">Weak form estimation of nonlinear dynamics (</w:t>
+        </w:r>
+        <w:r>
+          <w:rPr>
+            <w:rStyle w:val="Hyperlink"/>
+          </w:rPr>
+          <w:t xml:space="preserve">WENDy</w:t>
+        </w:r>
+        <w:r>
+          <w:rPr>
+            <w:rStyle w:val="Hyperlink"/>
+          </w:rPr>
+          <w:t xml:space="preserve">) for nonlinear-in-parameters</w:t>
+        </w:r>
+        <w:r>
+          <w:rPr>
+            <w:rStyle w:val="Hyperlink"/>
+          </w:rPr>
+          <w:t xml:space="preserve"> </w:t>
+        </w:r>
+        <w:r>
+          <w:rPr>
+            <w:rStyle w:val="Hyperlink"/>
+          </w:rPr>
+          <w:t xml:space="preserve">ODEs</w:t>
+        </w:r>
+      </w:hyperlink>
+      <w:r>
+        <w:t xml:space="preserve">. arXiv preprint arXiv:2502.08881v3 (2025).</w:t>
+      </w:r>
+    </w:p>
     <w:bookmarkEnd w:id="18"/>
+    <w:bookmarkEnd w:id="19"/>
+    <w:bookmarkEnd w:id="20"/>
     <w:sectPr>
       <w:footnotePr>
         <w:numRestart w:val="eachSect"/>

</xml_diff>